<commit_message>
fix curcor and change jobdetail section fix template
</commit_message>
<xml_diff>
--- a/public/template_v15.docx
+++ b/public/template_v15.docx
@@ -4280,18 +4280,20 @@
               <w:szCs w:val="25"/>
             </w:rPr>
           </w:pPr>
+        </w:p>
+        <w:p>
           <w:r>
             <w:rPr>
               <w:noProof/>
             </w:rPr>
             <w:drawing>
-              <wp:anchor distT="0" distB="0" distL="114300" distR="114300" simplePos="0" relativeHeight="251658241" behindDoc="0" locked="0" layoutInCell="1" allowOverlap="1" wp14:anchorId="1A228C3A" wp14:editId="2C6F4CE7">
+              <wp:anchor distT="0" distB="0" distL="114300" distR="114300" simplePos="0" relativeHeight="251658241" behindDoc="0" locked="0" layoutInCell="1" allowOverlap="1" wp14:anchorId="1A228C3A" wp14:editId="2FEDEABB">
                 <wp:simplePos x="0" y="0"/>
                 <wp:positionH relativeFrom="column">
-                  <wp:posOffset>636849</wp:posOffset>
+                  <wp:posOffset>704850</wp:posOffset>
                 </wp:positionH>
                 <wp:positionV relativeFrom="paragraph">
-                  <wp:posOffset>186243</wp:posOffset>
+                  <wp:posOffset>179070</wp:posOffset>
                 </wp:positionV>
                 <wp:extent cx="545465" cy="632460"/>
                 <wp:effectExtent l="0" t="0" r="6985" b="0"/>

</xml_diff>

<commit_message>
delete sig adjest logo and detail
</commit_message>
<xml_diff>
--- a/public/template_v15.docx
+++ b/public/template_v15.docx
@@ -3908,6 +3908,7 @@
                 <w:rFonts w:ascii="TH Sarabun New" w:hAnsi="TH Sarabun New" w:cs="TH Sarabun New"/>
                 <w:b/>
                 <w:bCs/>
+                <w:cs/>
               </w:rPr>
             </w:pPr>
             <w:r>
@@ -3915,26 +3916,27 @@
                 <w:rFonts w:ascii="TH Sarabun New" w:hAnsi="TH Sarabun New" w:cs="TH Sarabun New"/>
                 <w:b/>
                 <w:bCs/>
-              </w:rPr>
-              <w:t>{%</w:t>
-            </w:r>
-            <w:proofErr w:type="spellStart"/>
-            <w:r>
+                <w:cs/>
+              </w:rPr>
+              <w:t>นาย/นาง</w:t>
+            </w:r>
+          </w:p>
+          <w:p>
+            <w:pPr>
+              <w:jc w:val="center"/>
               <w:rPr>
                 <w:rFonts w:ascii="TH Sarabun New" w:hAnsi="TH Sarabun New" w:cs="TH Sarabun New"/>
                 <w:b/>
                 <w:bCs/>
               </w:rPr>
-              <w:t>reportedBySig</w:t>
-            </w:r>
-            <w:proofErr w:type="spellEnd"/>
+            </w:pPr>
             <w:r>
               <w:rPr>
                 <w:rFonts w:ascii="TH Sarabun New" w:hAnsi="TH Sarabun New" w:cs="TH Sarabun New"/>
                 <w:b/>
                 <w:bCs/>
               </w:rPr>
-              <w:t>}</w:t>
+              <w:t>--------------------------------------------------------------------</w:t>
             </w:r>
           </w:p>
           <w:p>

</xml_diff>